<commit_message>
docs: update Project Guide to Mr. Irfan Rajab Bhat across all reports and certificates
</commit_message>
<xml_diff>
--- a/Report_1_Certificates_and_Front_Matter.docx
+++ b/Report_1_Certificates_and_Front_Matter.docx
@@ -367,6 +367,7 @@
     </w:p>
     <w:p>
       <w:pPr>
+        <w:spacing w:line="276" w:lineRule="auto"/>
         <w:jc w:val="center"/>
         <w:rPr>
           <w:rFonts w:ascii="Times New Roman" w:hAnsi="Times New Roman" w:cs="Times New Roman"/>
@@ -378,71 +379,15 @@
           <w:lang w:val="en-IN"/>
         </w:rPr>
       </w:pPr>
-      <w:r>
-        <w:rPr>
-          <w:rFonts w:ascii="Times New Roman" w:hAnsi="Times New Roman" w:cs="Times New Roman"/>
-          <w:b/>
-          <w:bCs/>
-          <w:color w:val="000000" w:themeColor="text1"/>
-          <w:sz w:val="40"/>
-          <w:szCs w:val="40"/>
-        </w:rPr>
-        <w:t>M</w:t>
-      </w:r>
-      <w:r>
-        <w:rPr>
-          <w:rFonts w:ascii="Times New Roman" w:hAnsi="Times New Roman" w:cs="Times New Roman"/>
-          <w:b/>
-          <w:bCs/>
-          <w:color w:val="000000" w:themeColor="text1"/>
-          <w:sz w:val="40"/>
-          <w:szCs w:val="40"/>
-        </w:rPr>
-        <w:t>s</w:t>
-      </w:r>
-      <w:r>
-        <w:rPr>
-          <w:rFonts w:ascii="Times New Roman" w:hAnsi="Times New Roman" w:cs="Times New Roman"/>
-          <w:b/>
-          <w:bCs/>
-          <w:color w:val="000000" w:themeColor="text1"/>
-          <w:sz w:val="40"/>
-          <w:szCs w:val="40"/>
-        </w:rPr>
-        <w:t>. S</w:t>
-      </w:r>
-      <w:r>
-        <w:rPr>
-          <w:rFonts w:ascii="Times New Roman" w:hAnsi="Times New Roman" w:cs="Times New Roman"/>
-          <w:b/>
-          <w:bCs/>
-          <w:color w:val="000000" w:themeColor="text1"/>
-          <w:sz w:val="40"/>
-          <w:szCs w:val="40"/>
-        </w:rPr>
-        <w:t>EERAT</w:t>
-      </w:r>
-      <w:r>
-        <w:rPr>
-          <w:rFonts w:ascii="Times New Roman" w:hAnsi="Times New Roman" w:cs="Times New Roman"/>
-          <w:b/>
-          <w:bCs/>
-          <w:color w:val="000000" w:themeColor="text1"/>
-          <w:sz w:val="40"/>
-          <w:szCs w:val="40"/>
-        </w:rPr>
-        <w:t xml:space="preserve"> Ul N</w:t>
-      </w:r>
-      <w:r>
-        <w:rPr>
-          <w:rFonts w:ascii="Times New Roman" w:hAnsi="Times New Roman" w:cs="Times New Roman"/>
-          <w:b/>
-          <w:bCs/>
-          <w:color w:val="000000" w:themeColor="text1"/>
-          <w:sz w:val="40"/>
-          <w:szCs w:val="40"/>
-        </w:rPr>
-        <w:t>ISA</w:t>
+      <w:r/>
+      <w:r>
+        <w:rPr>
+          <w:rFonts w:ascii="Times New Roman" w:hAnsi="Times New Roman"/>
+          <w:b/>
+          <w:color w:val="000000"/>
+          <w:sz w:val="36"/>
+        </w:rPr>
+        <w:t>Mr. IRFAN RAJAB BHAT</w:t>
       </w:r>
     </w:p>
     <w:p>
@@ -922,86 +867,26 @@
           </w:tcPr>
           <w:p>
             <w:pPr>
-              <w:spacing w:after="0" w:line="276" w:lineRule="auto"/>
-              <w:rPr>
-                <w:rFonts w:ascii="Times New Roman" w:hAnsi="Times New Roman" w:cs="Times New Roman"/>
+              <w:spacing w:line="252" w:lineRule="auto" w:after="40"/>
+              <w:jc w:val="left"/>
+            </w:pPr>
+            <w:r/>
+            <w:r>
+              <w:rPr>
+                <w:rFonts w:ascii="Times New Roman" w:hAnsi="Times New Roman"/>
                 <w:b/>
-                <w:bCs/>
-                <w:sz w:val="24"/>
-                <w:szCs w:val="24"/>
-              </w:rPr>
-            </w:pPr>
-            <w:bookmarkStart w:id="0" w:name="_Hlk104927292"/>
-            <w:r>
-              <w:rPr>
-                <w:rFonts w:ascii="Times New Roman" w:hAnsi="Times New Roman" w:cs="Times New Roman"/>
-                <w:b/>
-                <w:bCs/>
-                <w:sz w:val="24"/>
-                <w:szCs w:val="24"/>
-              </w:rPr>
-              <w:t>Ms.</w:t>
+                <w:sz w:val="20"/>
+              </w:rPr>
+              <w:t>Mr. Irfan Rajab Bhat</w:t>
+              <w:br/>
             </w:r>
             <w:r>
               <w:rPr>
-                <w:rFonts w:ascii="Times New Roman" w:hAnsi="Times New Roman" w:cs="Times New Roman"/>
-                <w:b/>
-                <w:bCs/>
-                <w:sz w:val="24"/>
-                <w:szCs w:val="24"/>
-              </w:rPr>
-              <w:t xml:space="preserve"> Seerat ul Nisa</w:t>
-            </w:r>
-          </w:p>
-          <w:p>
-            <w:pPr>
-              <w:spacing w:after="0" w:line="276" w:lineRule="auto"/>
-              <w:rPr>
-                <w:rFonts w:ascii="Times New Roman" w:hAnsi="Times New Roman" w:cs="Times New Roman"/>
-                <w:sz w:val="24"/>
-                <w:szCs w:val="24"/>
-              </w:rPr>
-            </w:pPr>
-            <w:r>
-              <w:rPr>
-                <w:rFonts w:ascii="Times New Roman" w:hAnsi="Times New Roman" w:cs="Times New Roman"/>
-                <w:sz w:val="24"/>
-                <w:szCs w:val="24"/>
-              </w:rPr>
-              <w:t>Project Guide</w:t>
-            </w:r>
-            <w:r>
-              <w:rPr>
-                <w:rFonts w:ascii="Times New Roman" w:hAnsi="Times New Roman" w:cs="Times New Roman"/>
-                <w:sz w:val="24"/>
-                <w:szCs w:val="24"/>
-              </w:rPr>
-              <w:t xml:space="preserve">, </w:t>
-            </w:r>
-            <w:r>
-              <w:rPr>
-                <w:rFonts w:ascii="Times New Roman" w:hAnsi="Times New Roman" w:cs="Times New Roman"/>
-                <w:sz w:val="24"/>
-                <w:szCs w:val="24"/>
-              </w:rPr>
-              <w:t>PSCS</w:t>
-            </w:r>
-          </w:p>
-          <w:p>
-            <w:pPr>
-              <w:spacing w:after="0" w:line="276" w:lineRule="auto"/>
-              <w:rPr>
-                <w:rFonts w:ascii="Times New Roman" w:hAnsi="Times New Roman" w:cs="Times New Roman"/>
-                <w:sz w:val="24"/>
-                <w:szCs w:val="24"/>
-              </w:rPr>
-            </w:pPr>
-            <w:r>
-              <w:rPr>
-                <w:rFonts w:ascii="Times New Roman" w:hAnsi="Times New Roman" w:cs="Times New Roman"/>
-                <w:sz w:val="24"/>
-                <w:szCs w:val="24"/>
-              </w:rPr>
+                <w:rFonts w:ascii="Times New Roman" w:hAnsi="Times New Roman"/>
+                <w:sz w:val="20"/>
+              </w:rPr>
+              <w:t>Project Guide, PSCS</w:t>
+              <w:br/>
               <w:t>Presidency University</w:t>
             </w:r>
           </w:p>
@@ -2540,108 +2425,15 @@
           <w:szCs w:val="24"/>
         </w:rPr>
       </w:pPr>
-      <w:r>
-        <w:rPr>
-          <w:rFonts w:ascii="Times New Roman" w:hAnsi="Times New Roman" w:cs="Times New Roman"/>
-          <w:sz w:val="24"/>
-          <w:szCs w:val="24"/>
-        </w:rPr>
-        <w:t>We</w:t>
-      </w:r>
-      <w:r>
-        <w:rPr>
-          <w:rFonts w:ascii="Times New Roman" w:hAnsi="Times New Roman" w:cs="Times New Roman"/>
-          <w:sz w:val="24"/>
-          <w:szCs w:val="24"/>
-        </w:rPr>
-        <w:t xml:space="preserve"> would like to sincerely thank </w:t>
-      </w:r>
-      <w:r>
-        <w:rPr>
-          <w:rFonts w:ascii="Times New Roman" w:hAnsi="Times New Roman" w:cs="Times New Roman"/>
-          <w:sz w:val="24"/>
-          <w:szCs w:val="24"/>
-        </w:rPr>
-        <w:t>our</w:t>
-      </w:r>
-      <w:r>
-        <w:rPr>
-          <w:rFonts w:ascii="Times New Roman" w:hAnsi="Times New Roman" w:cs="Times New Roman"/>
-          <w:sz w:val="24"/>
-          <w:szCs w:val="24"/>
-        </w:rPr>
-        <w:t xml:space="preserve"> internal guide </w:t>
-      </w:r>
-      <w:proofErr w:type="spellStart"/>
-      <w:proofErr w:type="gramStart"/>
-      <w:r>
-        <w:rPr>
-          <w:rFonts w:ascii="Times New Roman" w:hAnsi="Times New Roman" w:cs="Times New Roman"/>
-          <w:b/>
-          <w:bCs/>
-          <w:color w:val="000000" w:themeColor="text1"/>
-          <w:sz w:val="24"/>
-          <w:szCs w:val="24"/>
-        </w:rPr>
-        <w:t>Ms.</w:t>
-      </w:r>
-      <w:r>
-        <w:rPr>
-          <w:rFonts w:ascii="Times New Roman" w:hAnsi="Times New Roman" w:cs="Times New Roman"/>
-          <w:b/>
-          <w:bCs/>
-          <w:sz w:val="24"/>
-          <w:szCs w:val="24"/>
-        </w:rPr>
-        <w:t>Seerat</w:t>
-      </w:r>
-      <w:proofErr w:type="spellEnd"/>
-      <w:proofErr w:type="gramEnd"/>
-      <w:r>
-        <w:rPr>
-          <w:rFonts w:ascii="Times New Roman" w:hAnsi="Times New Roman" w:cs="Times New Roman"/>
-          <w:b/>
-          <w:bCs/>
-          <w:sz w:val="24"/>
-          <w:szCs w:val="24"/>
-        </w:rPr>
-        <w:t xml:space="preserve"> ul Nisa</w:t>
-      </w:r>
-      <w:r>
-        <w:rPr>
-          <w:rFonts w:ascii="Times New Roman" w:hAnsi="Times New Roman" w:cs="Times New Roman"/>
-          <w:b/>
-          <w:bCs/>
-          <w:color w:val="000000" w:themeColor="text1"/>
-          <w:sz w:val="24"/>
-          <w:szCs w:val="24"/>
-        </w:rPr>
-        <w:t>, Professor/Associate Professor/Assistant Professor</w:t>
-      </w:r>
-      <w:r>
-        <w:rPr>
-          <w:rFonts w:ascii="Times New Roman" w:hAnsi="Times New Roman" w:cs="Times New Roman"/>
-          <w:sz w:val="24"/>
-          <w:szCs w:val="24"/>
-        </w:rPr>
-        <w:t xml:space="preserve">, Presidency School of Computer Science and Engineering, Presidency University, for </w:t>
-      </w:r>
-      <w:r>
-        <w:rPr>
-          <w:rFonts w:ascii="Times New Roman" w:hAnsi="Times New Roman" w:cs="Times New Roman"/>
-          <w:color w:val="000000" w:themeColor="text1"/>
-          <w:sz w:val="24"/>
-          <w:szCs w:val="24"/>
-        </w:rPr>
-        <w:t xml:space="preserve">his/her </w:t>
-      </w:r>
-      <w:r>
-        <w:rPr>
-          <w:rFonts w:ascii="Times New Roman" w:hAnsi="Times New Roman" w:cs="Times New Roman"/>
-          <w:sz w:val="24"/>
-          <w:szCs w:val="24"/>
-        </w:rPr>
-        <w:t>moral support, motivation, timely guidance and encouragement provided to us during the period of our project work.</w:t>
+      <w:r/>
+      <w:r>
+        <w:rPr>
+          <w:rFonts w:ascii="Times New Roman" w:hAnsi="Times New Roman"/>
+          <w:b w:val="0"/>
+          <w:color w:val="000000"/>
+          <w:sz w:val="24"/>
+        </w:rPr>
+        <w:t>We would like to sincerely thank our internal guide Mr. Irfan Rajab Bhat, Assistant Professor, Presidency School of Computer Science and Engineering, Presidency University, for his moral support, motivation, timely guidance and encouragement provided to us during the period of our project work.</w:t>
       </w:r>
     </w:p>
     <w:p>

</xml_diff>